<commit_message>
[docs] reorder architecture and design approaches
</commit_message>
<xml_diff>
--- a/architecture/GoF_Design_Pattern_and_Architecture_v11.docx
+++ b/architecture/GoF_Design_Pattern_and_Architecture_v11.docx
@@ -146,21 +146,25 @@
       <w:r>
         <w:t xml:space="preserve"> </w:t>
       </w:r>
+      <w:proofErr w:type="spellStart"/>
       <w:r>
         <w:rPr>
           <w:rFonts w:ascii="맑은 고딕" w:eastAsia="맑은 고딕" w:hAnsi="맑은 고딕" w:cs="맑은 고딕" w:hint="eastAsia"/>
         </w:rPr>
         <w:t>설계에</w:t>
       </w:r>
-      <w:r>
-        <w:t xml:space="preserve"> </w:t>
-      </w:r>
+      <w:proofErr w:type="spellEnd"/>
+      <w:r>
+        <w:t xml:space="preserve"> </w:t>
+      </w:r>
+      <w:proofErr w:type="spellStart"/>
       <w:r>
         <w:rPr>
           <w:rFonts w:ascii="맑은 고딕" w:eastAsia="맑은 고딕" w:hAnsi="맑은 고딕" w:cs="맑은 고딕" w:hint="eastAsia"/>
         </w:rPr>
         <w:t>사용되는</w:t>
       </w:r>
+      <w:proofErr w:type="spellEnd"/>
       <w:r>
         <w:t xml:space="preserve"> Architecture Style, Design Approach, Design Role, Design Pattern</w:t>
       </w:r>
@@ -329,6 +333,12 @@
       </w:r>
     </w:p>
     <w:p>
+      <w:pPr>
+        <w:rPr>
+          <w:rFonts w:eastAsia="맑은 고딕"/>
+          <w:lang w:eastAsia="ko-KR"/>
+        </w:rPr>
+      </w:pPr>
       <w:r>
         <w:rPr>
           <w:b/>
@@ -507,15 +517,19 @@
       <w:r>
         <w:t xml:space="preserve">Layered, Hexagonal, Clean, Onion, Event-Driven </w:t>
       </w:r>
+      <w:proofErr w:type="spellStart"/>
       <w:r>
         <w:t>등이</w:t>
       </w:r>
-      <w:r>
-        <w:t xml:space="preserve"> </w:t>
-      </w:r>
+      <w:proofErr w:type="spellEnd"/>
+      <w:r>
+        <w:t xml:space="preserve"> </w:t>
+      </w:r>
+      <w:proofErr w:type="spellStart"/>
       <w:r>
         <w:t>대표적이다</w:t>
       </w:r>
+      <w:proofErr w:type="spellEnd"/>
       <w:r>
         <w:t>.</w:t>
       </w:r>
@@ -526,149 +540,291 @@
           <w:lang w:eastAsia="ko-KR"/>
         </w:rPr>
       </w:pPr>
+      <w:proofErr w:type="gramStart"/>
       <w:r>
         <w:rPr>
           <w:b/>
-        </w:rPr>
-        <w:t>Design Pattern</w:t>
-      </w:r>
-      <w:r>
-        <w:t>은</w:t>
-      </w:r>
-      <w:r>
-        <w:t xml:space="preserve"> </w:t>
-      </w:r>
-      <w:r>
-        <w:t>반복적으로</w:t>
-      </w:r>
-      <w:r>
-        <w:t xml:space="preserve"> </w:t>
-      </w:r>
-      <w:r>
-        <w:t>나타나는</w:t>
-      </w:r>
-      <w:r>
-        <w:t xml:space="preserve"> </w:t>
-      </w:r>
-      <w:r>
-        <w:t>소프트웨어</w:t>
-      </w:r>
-      <w:r>
-        <w:t xml:space="preserve"> </w:t>
-      </w:r>
-      <w:r>
+          <w:lang w:eastAsia="ko-KR"/>
+        </w:rPr>
+        <w:t>Architecture /</w:t>
+      </w:r>
+      <w:proofErr w:type="gramEnd"/>
+      <w:r>
+        <w:rPr>
+          <w:b/>
+          <w:lang w:eastAsia="ko-KR"/>
+        </w:rPr>
+        <w:t xml:space="preserve"> Design Approach</w:t>
+      </w:r>
+      <w:r>
+        <w:rPr>
+          <w:lang w:eastAsia="ko-KR"/>
+        </w:rPr>
+        <w:t>는</w:t>
+      </w:r>
+      <w:r>
+        <w:rPr>
+          <w:lang w:eastAsia="ko-KR"/>
+        </w:rPr>
+        <w:t xml:space="preserve"> </w:t>
+      </w:r>
+      <w:r>
+        <w:rPr>
+          <w:lang w:eastAsia="ko-KR"/>
+        </w:rPr>
+        <w:t>시스템의</w:t>
+      </w:r>
+      <w:r>
+        <w:rPr>
+          <w:lang w:eastAsia="ko-KR"/>
+        </w:rPr>
+        <w:t xml:space="preserve"> </w:t>
+      </w:r>
+      <w:r>
+        <w:rPr>
+          <w:lang w:eastAsia="ko-KR"/>
+        </w:rPr>
+        <w:t>상위</w:t>
+      </w:r>
+      <w:r>
+        <w:rPr>
+          <w:lang w:eastAsia="ko-KR"/>
+        </w:rPr>
+        <w:t xml:space="preserve"> </w:t>
+      </w:r>
+      <w:r>
+        <w:rPr>
+          <w:lang w:eastAsia="ko-KR"/>
+        </w:rPr>
+        <w:t>구조와</w:t>
+      </w:r>
+      <w:r>
+        <w:rPr>
+          <w:lang w:eastAsia="ko-KR"/>
+        </w:rPr>
+        <w:t xml:space="preserve"> </w:t>
+      </w:r>
+      <w:r>
+        <w:rPr>
+          <w:lang w:eastAsia="ko-KR"/>
+        </w:rPr>
         <w:t>설계</w:t>
       </w:r>
       <w:r>
-        <w:t xml:space="preserve"> </w:t>
-      </w:r>
-      <w:r>
-        <w:t>문제에</w:t>
-      </w:r>
-      <w:r>
-        <w:t xml:space="preserve"> </w:t>
-      </w:r>
-      <w:r>
-        <w:t>대한</w:t>
-      </w:r>
-      <w:r>
-        <w:t xml:space="preserve"> </w:t>
-      </w:r>
-      <w:r>
-        <w:t>재사용</w:t>
-      </w:r>
-      <w:r>
-        <w:t xml:space="preserve"> </w:t>
-      </w:r>
-      <w:r>
-        <w:t>가능한</w:t>
-      </w:r>
-      <w:r>
-        <w:t xml:space="preserve"> </w:t>
-      </w:r>
-      <w:r>
-        <w:t>해결</w:t>
-      </w:r>
-      <w:r>
-        <w:t xml:space="preserve"> </w:t>
-      </w:r>
-      <w:r>
-        <w:t>구조이다</w:t>
-      </w:r>
-      <w:r>
-        <w:t xml:space="preserve">. </w:t>
-      </w:r>
-      <w:r>
-        <w:rPr>
-          <w:lang w:eastAsia="ko-KR"/>
-        </w:rPr>
-        <w:t xml:space="preserve">GoF </w:t>
-      </w:r>
-      <w:r>
-        <w:rPr>
-          <w:lang w:eastAsia="ko-KR"/>
-        </w:rPr>
-        <w:t>패턴은</w:t>
-      </w:r>
-      <w:r>
-        <w:rPr>
-          <w:lang w:eastAsia="ko-KR"/>
-        </w:rPr>
-        <w:t xml:space="preserve"> </w:t>
-      </w:r>
-      <w:r>
-        <w:rPr>
-          <w:lang w:eastAsia="ko-KR"/>
-        </w:rPr>
-        <w:t>생성</w:t>
-      </w:r>
-      <w:r>
-        <w:rPr>
-          <w:lang w:eastAsia="ko-KR"/>
-        </w:rPr>
-        <w:t xml:space="preserve">(Creational), </w:t>
-      </w:r>
-      <w:r>
-        <w:rPr>
-          <w:lang w:eastAsia="ko-KR"/>
-        </w:rPr>
-        <w:t>구조</w:t>
-      </w:r>
-      <w:r>
-        <w:rPr>
-          <w:lang w:eastAsia="ko-KR"/>
-        </w:rPr>
-        <w:t xml:space="preserve">(Structural), </w:t>
-      </w:r>
-      <w:r>
-        <w:rPr>
-          <w:lang w:eastAsia="ko-KR"/>
-        </w:rPr>
-        <w:t>행위</w:t>
-      </w:r>
-      <w:r>
-        <w:rPr>
-          <w:lang w:eastAsia="ko-KR"/>
-        </w:rPr>
-        <w:t>(Behavioral)</w:t>
-      </w:r>
-      <w:r>
-        <w:rPr>
-          <w:lang w:eastAsia="ko-KR"/>
-        </w:rPr>
-        <w:t>로</w:t>
-      </w:r>
-      <w:r>
-        <w:rPr>
-          <w:lang w:eastAsia="ko-KR"/>
-        </w:rPr>
-        <w:t xml:space="preserve"> </w:t>
-      </w:r>
-      <w:r>
-        <w:rPr>
-          <w:lang w:eastAsia="ko-KR"/>
-        </w:rPr>
-        <w:t>분류한다</w:t>
+        <w:rPr>
+          <w:lang w:eastAsia="ko-KR"/>
+        </w:rPr>
+        <w:t xml:space="preserve"> </w:t>
+      </w:r>
+      <w:r>
+        <w:rPr>
+          <w:lang w:eastAsia="ko-KR"/>
+        </w:rPr>
+        <w:t>방향을</w:t>
+      </w:r>
+      <w:r>
+        <w:rPr>
+          <w:lang w:eastAsia="ko-KR"/>
+        </w:rPr>
+        <w:t xml:space="preserve"> </w:t>
+      </w:r>
+      <w:r>
+        <w:rPr>
+          <w:lang w:eastAsia="ko-KR"/>
+        </w:rPr>
+        <w:t>결정하는</w:t>
+      </w:r>
+      <w:r>
+        <w:rPr>
+          <w:lang w:eastAsia="ko-KR"/>
+        </w:rPr>
+        <w:t xml:space="preserve"> </w:t>
+      </w:r>
+      <w:r>
+        <w:rPr>
+          <w:lang w:eastAsia="ko-KR"/>
+        </w:rPr>
+        <w:t>접근법이다</w:t>
+      </w:r>
+      <w:r>
+        <w:rPr>
+          <w:lang w:eastAsia="ko-KR"/>
+        </w:rPr>
+        <w:t xml:space="preserve">. Presentation </w:t>
+      </w:r>
+      <w:r>
+        <w:rPr>
+          <w:lang w:eastAsia="ko-KR"/>
+        </w:rPr>
+        <w:t>요청</w:t>
+      </w:r>
+      <w:r>
+        <w:rPr>
+          <w:lang w:eastAsia="ko-KR"/>
+        </w:rPr>
+        <w:t xml:space="preserve"> </w:t>
+      </w:r>
+      <w:r>
+        <w:rPr>
+          <w:lang w:eastAsia="ko-KR"/>
+        </w:rPr>
+        <w:t>처리</w:t>
+      </w:r>
+      <w:r>
+        <w:rPr>
+          <w:lang w:eastAsia="ko-KR"/>
+        </w:rPr>
+        <w:t xml:space="preserve"> </w:t>
+      </w:r>
+      <w:r>
+        <w:rPr>
+          <w:lang w:eastAsia="ko-KR"/>
+        </w:rPr>
+        <w:t>구조나</w:t>
+      </w:r>
+      <w:r>
+        <w:rPr>
+          <w:lang w:eastAsia="ko-KR"/>
+        </w:rPr>
+        <w:t xml:space="preserve"> Domain </w:t>
+      </w:r>
+      <w:r>
+        <w:rPr>
+          <w:lang w:eastAsia="ko-KR"/>
+        </w:rPr>
+        <w:t>모델링</w:t>
+      </w:r>
+      <w:r>
+        <w:rPr>
+          <w:lang w:eastAsia="ko-KR"/>
+        </w:rPr>
+        <w:t xml:space="preserve"> </w:t>
+      </w:r>
+      <w:r>
+        <w:rPr>
+          <w:lang w:eastAsia="ko-KR"/>
+        </w:rPr>
+        <w:t>방식처럼</w:t>
+      </w:r>
+      <w:r>
+        <w:rPr>
+          <w:lang w:eastAsia="ko-KR"/>
+        </w:rPr>
+        <w:t xml:space="preserve"> </w:t>
+      </w:r>
+      <w:r>
+        <w:rPr>
+          <w:lang w:eastAsia="ko-KR"/>
+        </w:rPr>
+        <w:t>시스템의</w:t>
+      </w:r>
+      <w:r>
+        <w:rPr>
+          <w:lang w:eastAsia="ko-KR"/>
+        </w:rPr>
+        <w:t xml:space="preserve"> </w:t>
+      </w:r>
+      <w:r>
+        <w:rPr>
+          <w:lang w:eastAsia="ko-KR"/>
+        </w:rPr>
+        <w:t>책임</w:t>
+      </w:r>
+      <w:r>
+        <w:rPr>
+          <w:lang w:eastAsia="ko-KR"/>
+        </w:rPr>
+        <w:t xml:space="preserve"> </w:t>
+      </w:r>
+      <w:r>
+        <w:rPr>
+          <w:lang w:eastAsia="ko-KR"/>
+        </w:rPr>
+        <w:t>경계와</w:t>
+      </w:r>
+      <w:r>
+        <w:rPr>
+          <w:lang w:eastAsia="ko-KR"/>
+        </w:rPr>
+        <w:t xml:space="preserve"> </w:t>
+      </w:r>
+      <w:r>
+        <w:rPr>
+          <w:lang w:eastAsia="ko-KR"/>
+        </w:rPr>
+        <w:t>구성</w:t>
+      </w:r>
+      <w:r>
+        <w:rPr>
+          <w:lang w:eastAsia="ko-KR"/>
+        </w:rPr>
+        <w:t xml:space="preserve"> </w:t>
+      </w:r>
+      <w:r>
+        <w:rPr>
+          <w:lang w:eastAsia="ko-KR"/>
+        </w:rPr>
+        <w:t>원칙을</w:t>
+      </w:r>
+      <w:r>
+        <w:rPr>
+          <w:lang w:eastAsia="ko-KR"/>
+        </w:rPr>
+        <w:t xml:space="preserve"> </w:t>
+      </w:r>
+      <w:r>
+        <w:rPr>
+          <w:lang w:eastAsia="ko-KR"/>
+        </w:rPr>
+        <w:t>정의하며</w:t>
+      </w:r>
+      <w:r>
+        <w:rPr>
+          <w:lang w:eastAsia="ko-KR"/>
+        </w:rPr>
+        <w:t>, MVC2</w:t>
+      </w:r>
+      <w:r>
+        <w:rPr>
+          <w:lang w:eastAsia="ko-KR"/>
+        </w:rPr>
+        <w:t>와</w:t>
+      </w:r>
+      <w:r>
+        <w:rPr>
+          <w:lang w:eastAsia="ko-KR"/>
+        </w:rPr>
+        <w:t xml:space="preserve"> DDD</w:t>
+      </w:r>
+      <w:r>
+        <w:rPr>
+          <w:lang w:eastAsia="ko-KR"/>
+        </w:rPr>
+        <w:t>가</w:t>
+      </w:r>
+      <w:r>
+        <w:rPr>
+          <w:lang w:eastAsia="ko-KR"/>
+        </w:rPr>
+        <w:t xml:space="preserve"> </w:t>
+      </w:r>
+      <w:r>
+        <w:rPr>
+          <w:lang w:eastAsia="ko-KR"/>
+        </w:rPr>
+        <w:t>이에</w:t>
+      </w:r>
+      <w:r>
+        <w:rPr>
+          <w:lang w:eastAsia="ko-KR"/>
+        </w:rPr>
+        <w:t xml:space="preserve"> </w:t>
+      </w:r>
+      <w:r>
+        <w:rPr>
+          <w:lang w:eastAsia="ko-KR"/>
+        </w:rPr>
+        <w:t>해당한다</w:t>
       </w:r>
       <w:r>
         <w:rPr>
@@ -680,15 +836,25 @@
     <w:p>
       <w:pPr>
         <w:rPr>
+          <w:rFonts w:eastAsia="맑은 고딕" w:hint="eastAsia"/>
           <w:lang w:eastAsia="ko-KR"/>
         </w:rPr>
       </w:pPr>
+      <w:proofErr w:type="gramStart"/>
       <w:r>
         <w:rPr>
           <w:b/>
           <w:lang w:eastAsia="ko-KR"/>
         </w:rPr>
-        <w:t>Architecture / Design Role</w:t>
+        <w:t>Architecture /</w:t>
+      </w:r>
+      <w:proofErr w:type="gramEnd"/>
+      <w:r>
+        <w:rPr>
+          <w:b/>
+          <w:lang w:eastAsia="ko-KR"/>
+        </w:rPr>
+        <w:t xml:space="preserve"> Design Role</w:t>
       </w:r>
       <w:r>
         <w:rPr>
@@ -820,7 +986,21 @@
         <w:rPr>
           <w:lang w:eastAsia="ko-KR"/>
         </w:rPr>
-        <w:t xml:space="preserve"> GoF </w:t>
+        <w:t xml:space="preserve"> </w:t>
+      </w:r>
+      <w:proofErr w:type="spellStart"/>
+      <w:r>
+        <w:rPr>
+          <w:lang w:eastAsia="ko-KR"/>
+        </w:rPr>
+        <w:t>GoF</w:t>
+      </w:r>
+      <w:proofErr w:type="spellEnd"/>
+      <w:r>
+        <w:rPr>
+          <w:lang w:eastAsia="ko-KR"/>
+        </w:rPr>
+        <w:t xml:space="preserve"> </w:t>
       </w:r>
       <w:r>
         <w:rPr>
@@ -978,49 +1158,49 @@
           <w:b/>
           <w:lang w:eastAsia="ko-KR"/>
         </w:rPr>
-        <w:t>Architecture / Design Approach</w:t>
-      </w:r>
-      <w:r>
-        <w:rPr>
-          <w:lang w:eastAsia="ko-KR"/>
-        </w:rPr>
-        <w:t>는</w:t>
-      </w:r>
-      <w:r>
-        <w:rPr>
-          <w:lang w:eastAsia="ko-KR"/>
-        </w:rPr>
-        <w:t xml:space="preserve"> </w:t>
-      </w:r>
-      <w:r>
-        <w:rPr>
-          <w:lang w:eastAsia="ko-KR"/>
-        </w:rPr>
-        <w:t>시스템의</w:t>
-      </w:r>
-      <w:r>
-        <w:rPr>
-          <w:lang w:eastAsia="ko-KR"/>
-        </w:rPr>
-        <w:t xml:space="preserve"> </w:t>
-      </w:r>
-      <w:r>
-        <w:rPr>
-          <w:lang w:eastAsia="ko-KR"/>
-        </w:rPr>
-        <w:t>상위</w:t>
-      </w:r>
-      <w:r>
-        <w:rPr>
-          <w:lang w:eastAsia="ko-KR"/>
-        </w:rPr>
-        <w:t xml:space="preserve"> </w:t>
-      </w:r>
-      <w:r>
-        <w:rPr>
-          <w:lang w:eastAsia="ko-KR"/>
-        </w:rPr>
-        <w:t>구조와</w:t>
+        <w:t>Design Pattern</w:t>
+      </w:r>
+      <w:r>
+        <w:rPr>
+          <w:lang w:eastAsia="ko-KR"/>
+        </w:rPr>
+        <w:t>은</w:t>
+      </w:r>
+      <w:r>
+        <w:rPr>
+          <w:lang w:eastAsia="ko-KR"/>
+        </w:rPr>
+        <w:t xml:space="preserve"> </w:t>
+      </w:r>
+      <w:r>
+        <w:rPr>
+          <w:lang w:eastAsia="ko-KR"/>
+        </w:rPr>
+        <w:t>반복적으로</w:t>
+      </w:r>
+      <w:r>
+        <w:rPr>
+          <w:lang w:eastAsia="ko-KR"/>
+        </w:rPr>
+        <w:t xml:space="preserve"> </w:t>
+      </w:r>
+      <w:r>
+        <w:rPr>
+          <w:lang w:eastAsia="ko-KR"/>
+        </w:rPr>
+        <w:t>나타나는</w:t>
+      </w:r>
+      <w:r>
+        <w:rPr>
+          <w:lang w:eastAsia="ko-KR"/>
+        </w:rPr>
+        <w:t xml:space="preserve"> </w:t>
+      </w:r>
+      <w:r>
+        <w:rPr>
+          <w:lang w:eastAsia="ko-KR"/>
+        </w:rPr>
+        <w:t>소프트웨어</w:t>
       </w:r>
       <w:r>
         <w:rPr>
@@ -1044,211 +1224,153 @@
         <w:rPr>
           <w:lang w:eastAsia="ko-KR"/>
         </w:rPr>
-        <w:t>방향을</w:t>
-      </w:r>
-      <w:r>
-        <w:rPr>
-          <w:lang w:eastAsia="ko-KR"/>
-        </w:rPr>
-        <w:t xml:space="preserve"> </w:t>
-      </w:r>
-      <w:r>
-        <w:rPr>
-          <w:lang w:eastAsia="ko-KR"/>
-        </w:rPr>
-        <w:t>결정하는</w:t>
-      </w:r>
-      <w:r>
-        <w:rPr>
-          <w:lang w:eastAsia="ko-KR"/>
-        </w:rPr>
-        <w:t xml:space="preserve"> </w:t>
-      </w:r>
-      <w:r>
-        <w:rPr>
-          <w:lang w:eastAsia="ko-KR"/>
-        </w:rPr>
-        <w:t>접근법이다</w:t>
-      </w:r>
-      <w:r>
-        <w:rPr>
-          <w:lang w:eastAsia="ko-KR"/>
-        </w:rPr>
-        <w:t xml:space="preserve">. Presentation </w:t>
-      </w:r>
-      <w:r>
-        <w:rPr>
-          <w:lang w:eastAsia="ko-KR"/>
-        </w:rPr>
-        <w:t>요청</w:t>
-      </w:r>
-      <w:r>
-        <w:rPr>
-          <w:lang w:eastAsia="ko-KR"/>
-        </w:rPr>
-        <w:t xml:space="preserve"> </w:t>
-      </w:r>
-      <w:r>
-        <w:rPr>
-          <w:lang w:eastAsia="ko-KR"/>
-        </w:rPr>
-        <w:t>처리</w:t>
-      </w:r>
-      <w:r>
-        <w:rPr>
-          <w:lang w:eastAsia="ko-KR"/>
-        </w:rPr>
-        <w:t xml:space="preserve"> </w:t>
-      </w:r>
-      <w:r>
-        <w:rPr>
-          <w:lang w:eastAsia="ko-KR"/>
-        </w:rPr>
-        <w:t>구조나</w:t>
-      </w:r>
-      <w:r>
-        <w:rPr>
-          <w:lang w:eastAsia="ko-KR"/>
-        </w:rPr>
-        <w:t xml:space="preserve"> Domain </w:t>
-      </w:r>
-      <w:r>
-        <w:rPr>
-          <w:lang w:eastAsia="ko-KR"/>
-        </w:rPr>
-        <w:t>모델링</w:t>
-      </w:r>
-      <w:r>
-        <w:rPr>
-          <w:lang w:eastAsia="ko-KR"/>
-        </w:rPr>
-        <w:t xml:space="preserve"> </w:t>
-      </w:r>
-      <w:r>
-        <w:rPr>
-          <w:lang w:eastAsia="ko-KR"/>
-        </w:rPr>
-        <w:t>방식처럼</w:t>
-      </w:r>
-      <w:r>
-        <w:rPr>
-          <w:lang w:eastAsia="ko-KR"/>
-        </w:rPr>
-        <w:t xml:space="preserve"> </w:t>
-      </w:r>
-      <w:r>
-        <w:rPr>
-          <w:lang w:eastAsia="ko-KR"/>
-        </w:rPr>
-        <w:t>시스템의</w:t>
-      </w:r>
-      <w:r>
-        <w:rPr>
-          <w:lang w:eastAsia="ko-KR"/>
-        </w:rPr>
-        <w:t xml:space="preserve"> </w:t>
-      </w:r>
-      <w:r>
-        <w:rPr>
-          <w:lang w:eastAsia="ko-KR"/>
-        </w:rPr>
-        <w:t>책임</w:t>
-      </w:r>
-      <w:r>
-        <w:rPr>
-          <w:lang w:eastAsia="ko-KR"/>
-        </w:rPr>
-        <w:t xml:space="preserve"> </w:t>
-      </w:r>
-      <w:r>
-        <w:rPr>
-          <w:lang w:eastAsia="ko-KR"/>
-        </w:rPr>
-        <w:t>경계와</w:t>
-      </w:r>
-      <w:r>
-        <w:rPr>
-          <w:lang w:eastAsia="ko-KR"/>
-        </w:rPr>
-        <w:t xml:space="preserve"> </w:t>
-      </w:r>
-      <w:r>
-        <w:rPr>
-          <w:lang w:eastAsia="ko-KR"/>
-        </w:rPr>
-        <w:t>구성</w:t>
-      </w:r>
-      <w:r>
-        <w:rPr>
-          <w:lang w:eastAsia="ko-KR"/>
-        </w:rPr>
-        <w:t xml:space="preserve"> </w:t>
-      </w:r>
-      <w:r>
-        <w:rPr>
-          <w:lang w:eastAsia="ko-KR"/>
-        </w:rPr>
-        <w:t>원칙을</w:t>
-      </w:r>
-      <w:r>
-        <w:rPr>
-          <w:lang w:eastAsia="ko-KR"/>
-        </w:rPr>
-        <w:t xml:space="preserve"> </w:t>
-      </w:r>
-      <w:r>
-        <w:rPr>
-          <w:lang w:eastAsia="ko-KR"/>
-        </w:rPr>
-        <w:t>정의하며</w:t>
-      </w:r>
-      <w:r>
-        <w:rPr>
-          <w:lang w:eastAsia="ko-KR"/>
-        </w:rPr>
-        <w:t>, MVC2</w:t>
-      </w:r>
-      <w:r>
-        <w:rPr>
-          <w:lang w:eastAsia="ko-KR"/>
-        </w:rPr>
-        <w:t>와</w:t>
-      </w:r>
-      <w:r>
-        <w:rPr>
-          <w:lang w:eastAsia="ko-KR"/>
-        </w:rPr>
-        <w:t xml:space="preserve"> DDD</w:t>
-      </w:r>
-      <w:r>
-        <w:rPr>
-          <w:lang w:eastAsia="ko-KR"/>
-        </w:rPr>
-        <w:t>가</w:t>
-      </w:r>
-      <w:r>
-        <w:rPr>
-          <w:lang w:eastAsia="ko-KR"/>
-        </w:rPr>
-        <w:t xml:space="preserve"> </w:t>
-      </w:r>
-      <w:r>
-        <w:rPr>
-          <w:lang w:eastAsia="ko-KR"/>
-        </w:rPr>
-        <w:t>이에</w:t>
-      </w:r>
-      <w:r>
-        <w:rPr>
-          <w:lang w:eastAsia="ko-KR"/>
-        </w:rPr>
-        <w:t xml:space="preserve"> </w:t>
-      </w:r>
-      <w:r>
-        <w:rPr>
-          <w:lang w:eastAsia="ko-KR"/>
-        </w:rPr>
-        <w:t>해당한다</w:t>
+        <w:t>문제에</w:t>
+      </w:r>
+      <w:r>
+        <w:rPr>
+          <w:lang w:eastAsia="ko-KR"/>
+        </w:rPr>
+        <w:t xml:space="preserve"> </w:t>
+      </w:r>
+      <w:r>
+        <w:rPr>
+          <w:lang w:eastAsia="ko-KR"/>
+        </w:rPr>
+        <w:t>대한</w:t>
+      </w:r>
+      <w:r>
+        <w:rPr>
+          <w:lang w:eastAsia="ko-KR"/>
+        </w:rPr>
+        <w:t xml:space="preserve"> </w:t>
+      </w:r>
+      <w:r>
+        <w:rPr>
+          <w:lang w:eastAsia="ko-KR"/>
+        </w:rPr>
+        <w:t>재사용</w:t>
+      </w:r>
+      <w:r>
+        <w:rPr>
+          <w:lang w:eastAsia="ko-KR"/>
+        </w:rPr>
+        <w:t xml:space="preserve"> </w:t>
+      </w:r>
+      <w:r>
+        <w:rPr>
+          <w:lang w:eastAsia="ko-KR"/>
+        </w:rPr>
+        <w:t>가능한</w:t>
+      </w:r>
+      <w:r>
+        <w:rPr>
+          <w:lang w:eastAsia="ko-KR"/>
+        </w:rPr>
+        <w:t xml:space="preserve"> </w:t>
+      </w:r>
+      <w:r>
+        <w:rPr>
+          <w:lang w:eastAsia="ko-KR"/>
+        </w:rPr>
+        <w:t>해결</w:t>
+      </w:r>
+      <w:r>
+        <w:rPr>
+          <w:lang w:eastAsia="ko-KR"/>
+        </w:rPr>
+        <w:t xml:space="preserve"> </w:t>
+      </w:r>
+      <w:r>
+        <w:rPr>
+          <w:lang w:eastAsia="ko-KR"/>
+        </w:rPr>
+        <w:t>구조이다</w:t>
+      </w:r>
+      <w:r>
+        <w:rPr>
+          <w:lang w:eastAsia="ko-KR"/>
+        </w:rPr>
+        <w:t xml:space="preserve">. </w:t>
+      </w:r>
+      <w:proofErr w:type="spellStart"/>
+      <w:r>
+        <w:rPr>
+          <w:lang w:eastAsia="ko-KR"/>
+        </w:rPr>
+        <w:t>GoF</w:t>
+      </w:r>
+      <w:proofErr w:type="spellEnd"/>
+      <w:r>
+        <w:rPr>
+          <w:lang w:eastAsia="ko-KR"/>
+        </w:rPr>
+        <w:t xml:space="preserve"> </w:t>
+      </w:r>
+      <w:r>
+        <w:rPr>
+          <w:lang w:eastAsia="ko-KR"/>
+        </w:rPr>
+        <w:t>패턴은</w:t>
+      </w:r>
+      <w:r>
+        <w:rPr>
+          <w:lang w:eastAsia="ko-KR"/>
+        </w:rPr>
+        <w:t xml:space="preserve"> </w:t>
+      </w:r>
+      <w:r>
+        <w:rPr>
+          <w:lang w:eastAsia="ko-KR"/>
+        </w:rPr>
+        <w:t>생성</w:t>
+      </w:r>
+      <w:r>
+        <w:rPr>
+          <w:lang w:eastAsia="ko-KR"/>
+        </w:rPr>
+        <w:t xml:space="preserve">(Creational), </w:t>
+      </w:r>
+      <w:r>
+        <w:rPr>
+          <w:lang w:eastAsia="ko-KR"/>
+        </w:rPr>
+        <w:t>구조</w:t>
+      </w:r>
+      <w:r>
+        <w:rPr>
+          <w:lang w:eastAsia="ko-KR"/>
+        </w:rPr>
+        <w:t xml:space="preserve">(Structural), </w:t>
+      </w:r>
+      <w:r>
+        <w:rPr>
+          <w:lang w:eastAsia="ko-KR"/>
+        </w:rPr>
+        <w:t>행위</w:t>
+      </w:r>
+      <w:r>
+        <w:rPr>
+          <w:lang w:eastAsia="ko-KR"/>
+        </w:rPr>
+        <w:t>(Behavioral)</w:t>
+      </w:r>
+      <w:r>
+        <w:rPr>
+          <w:lang w:eastAsia="ko-KR"/>
+        </w:rPr>
+        <w:t>로</w:t>
+      </w:r>
+      <w:r>
+        <w:rPr>
+          <w:lang w:eastAsia="ko-KR"/>
+        </w:rPr>
+        <w:t xml:space="preserve"> </w:t>
+      </w:r>
+      <w:r>
+        <w:rPr>
+          <w:lang w:eastAsia="ko-KR"/>
+        </w:rPr>
+        <w:t>분류한다</w:t>
       </w:r>
       <w:r>
         <w:rPr>
@@ -1261,7 +1383,7 @@
       <w:pPr>
         <w:pStyle w:val="1"/>
         <w:rPr>
-          <w:rFonts w:eastAsia="맑은 고딕" w:hint="eastAsia"/>
+          <w:rFonts w:eastAsia="맑은 고딕"/>
           <w:lang w:eastAsia="ko-KR"/>
         </w:rPr>
       </w:pPr>
@@ -2078,24 +2200,28 @@
               </w:rPr>
               <w:t xml:space="preserve">, </w:t>
             </w:r>
+            <w:proofErr w:type="spellStart"/>
             <w:r>
               <w:rPr>
                 <w:sz w:val="15"/>
               </w:rPr>
               <w:t>협력</w:t>
             </w:r>
+            <w:proofErr w:type="spellEnd"/>
             <w:r>
               <w:rPr>
                 <w:sz w:val="15"/>
               </w:rPr>
               <w:t xml:space="preserve"> </w:t>
             </w:r>
+            <w:proofErr w:type="spellStart"/>
             <w:r>
               <w:rPr>
                 <w:sz w:val="15"/>
               </w:rPr>
               <w:t>관계</w:t>
             </w:r>
+            <w:proofErr w:type="spellEnd"/>
             <w:r>
               <w:rPr>
                 <w:sz w:val="15"/>
@@ -2467,8 +2593,16 @@
               <w:rPr>
                 <w:sz w:val="15"/>
               </w:rPr>
-              <w:t>, RetrievalPolicy</w:t>
-            </w:r>
+              <w:t xml:space="preserve">, </w:t>
+            </w:r>
+            <w:proofErr w:type="spellStart"/>
+            <w:r>
+              <w:rPr>
+                <w:sz w:val="15"/>
+              </w:rPr>
+              <w:t>RetrievalPolicy</w:t>
+            </w:r>
+            <w:proofErr w:type="spellEnd"/>
           </w:p>
         </w:tc>
       </w:tr>
@@ -2814,6 +2948,7 @@
         <w:pStyle w:val="21"/>
       </w:pPr>
       <w:r>
+        <w:lastRenderedPageBreak/>
         <w:t>4.1 Architecture Style</w:t>
       </w:r>
     </w:p>
@@ -9151,17 +9286,24 @@
       </w:r>
       <w:proofErr w:type="spellEnd"/>
       <w:r>
-        <w:t>, DDD</w:t>
+        <w:t xml:space="preserve">, </w:t>
+      </w:r>
+      <w:proofErr w:type="spellStart"/>
+      <w:r>
+        <w:t>DDD</w:t>
       </w:r>
       <w:r>
         <w:t>는</w:t>
       </w:r>
+      <w:proofErr w:type="spellEnd"/>
       <w:r>
         <w:t xml:space="preserve"> Domain </w:t>
       </w:r>
+      <w:proofErr w:type="spellStart"/>
       <w:r>
         <w:t>중심의</w:t>
       </w:r>
+      <w:proofErr w:type="spellEnd"/>
       <w:r>
         <w:t xml:space="preserve"> Design Approach</w:t>
       </w:r>
@@ -10264,7 +10406,21 @@
               <w:rPr>
                 <w:sz w:val="16"/>
               </w:rPr>
-              <w:t xml:space="preserve"> / RetrievalPolicy / AgentPolicy</w:t>
+              <w:t xml:space="preserve"> / </w:t>
+            </w:r>
+            <w:proofErr w:type="spellStart"/>
+            <w:r>
+              <w:rPr>
+                <w:sz w:val="16"/>
+              </w:rPr>
+              <w:t>RetrievalPolicy</w:t>
+            </w:r>
+            <w:proofErr w:type="spellEnd"/>
+            <w:r>
+              <w:rPr>
+                <w:sz w:val="16"/>
+              </w:rPr>
+              <w:t xml:space="preserve"> / AgentPolicy</w:t>
             </w:r>
           </w:p>
         </w:tc>
@@ -11330,260 +11486,14 @@
               <w:rPr>
                 <w:sz w:val="16"/>
               </w:rPr>
-              <w:t xml:space="preserve"> / HybridRetriever</w:t>
-            </w:r>
-          </w:p>
-        </w:tc>
-      </w:tr>
-      <w:tr>
-        <w:trPr>
-          <w:jc w:val="center"/>
-        </w:trPr>
-        <w:tc>
-          <w:tcPr>
-            <w:tcW w:w="2045" w:type="dxa"/>
-            <w:vAlign w:val="center"/>
-          </w:tcPr>
-          <w:p>
-            <w:r>
-              <w:rPr>
-                <w:sz w:val="16"/>
-              </w:rPr>
-              <w:t>Creational</w:t>
-            </w:r>
-          </w:p>
-        </w:tc>
-        <w:tc>
-          <w:tcPr>
-            <w:tcW w:w="2045" w:type="dxa"/>
-            <w:vAlign w:val="center"/>
-          </w:tcPr>
-          <w:p>
-            <w:r>
-              <w:rPr>
-                <w:sz w:val="16"/>
-              </w:rPr>
-              <w:t>Builder</w:t>
-            </w:r>
-          </w:p>
-        </w:tc>
-        <w:tc>
-          <w:tcPr>
-            <w:tcW w:w="2045" w:type="dxa"/>
-            <w:vAlign w:val="center"/>
-          </w:tcPr>
-          <w:p>
-            <w:pPr>
-              <w:rPr>
-                <w:lang w:eastAsia="ko-KR"/>
-              </w:rPr>
-            </w:pPr>
-            <w:r>
-              <w:rPr>
-                <w:sz w:val="16"/>
-                <w:lang w:eastAsia="ko-KR"/>
-              </w:rPr>
-              <w:t>복잡한</w:t>
-            </w:r>
-            <w:r>
-              <w:rPr>
-                <w:sz w:val="16"/>
-                <w:lang w:eastAsia="ko-KR"/>
-              </w:rPr>
-              <w:t xml:space="preserve"> </w:t>
-            </w:r>
-            <w:r>
-              <w:rPr>
-                <w:sz w:val="16"/>
-                <w:lang w:eastAsia="ko-KR"/>
-              </w:rPr>
-              <w:t>객체를</w:t>
-            </w:r>
-            <w:r>
-              <w:rPr>
-                <w:sz w:val="16"/>
-                <w:lang w:eastAsia="ko-KR"/>
-              </w:rPr>
-              <w:t xml:space="preserve"> </w:t>
-            </w:r>
-            <w:r>
-              <w:rPr>
-                <w:sz w:val="16"/>
-                <w:lang w:eastAsia="ko-KR"/>
-              </w:rPr>
-              <w:t>어떻게</w:t>
-            </w:r>
-            <w:r>
-              <w:rPr>
-                <w:sz w:val="16"/>
-                <w:lang w:eastAsia="ko-KR"/>
-              </w:rPr>
-              <w:t xml:space="preserve"> </w:t>
-            </w:r>
-            <w:r>
-              <w:rPr>
-                <w:sz w:val="16"/>
-                <w:lang w:eastAsia="ko-KR"/>
-              </w:rPr>
-              <w:lastRenderedPageBreak/>
-              <w:t>단계적으로</w:t>
-            </w:r>
-            <w:r>
-              <w:rPr>
-                <w:sz w:val="16"/>
-                <w:lang w:eastAsia="ko-KR"/>
-              </w:rPr>
-              <w:t xml:space="preserve"> </w:t>
-            </w:r>
-            <w:r>
-              <w:rPr>
-                <w:sz w:val="16"/>
-                <w:lang w:eastAsia="ko-KR"/>
-              </w:rPr>
-              <w:t>구성하는가</w:t>
-            </w:r>
-            <w:r>
-              <w:rPr>
-                <w:sz w:val="16"/>
-                <w:lang w:eastAsia="ko-KR"/>
-              </w:rPr>
-              <w:t>?</w:t>
-            </w:r>
-          </w:p>
-        </w:tc>
-        <w:tc>
-          <w:tcPr>
-            <w:tcW w:w="2045" w:type="dxa"/>
-            <w:vAlign w:val="center"/>
-          </w:tcPr>
-          <w:p>
-            <w:pPr>
-              <w:rPr>
-                <w:lang w:eastAsia="ko-KR"/>
-              </w:rPr>
-            </w:pPr>
-            <w:r>
-              <w:rPr>
-                <w:sz w:val="16"/>
-                <w:lang w:eastAsia="ko-KR"/>
-              </w:rPr>
-              <w:lastRenderedPageBreak/>
-              <w:t>복합</w:t>
-            </w:r>
-            <w:r>
-              <w:rPr>
-                <w:sz w:val="16"/>
-                <w:lang w:eastAsia="ko-KR"/>
-              </w:rPr>
-              <w:t xml:space="preserve"> </w:t>
-            </w:r>
-            <w:r>
-              <w:rPr>
-                <w:sz w:val="16"/>
-                <w:lang w:eastAsia="ko-KR"/>
-              </w:rPr>
-              <w:t>객체의</w:t>
-            </w:r>
-            <w:r>
-              <w:rPr>
-                <w:sz w:val="16"/>
-                <w:lang w:eastAsia="ko-KR"/>
-              </w:rPr>
-              <w:t xml:space="preserve"> </w:t>
-            </w:r>
-            <w:r>
-              <w:rPr>
-                <w:sz w:val="16"/>
-                <w:lang w:eastAsia="ko-KR"/>
-              </w:rPr>
-              <w:t>생성</w:t>
-            </w:r>
-            <w:r>
-              <w:rPr>
-                <w:sz w:val="16"/>
-                <w:lang w:eastAsia="ko-KR"/>
-              </w:rPr>
-              <w:t xml:space="preserve"> </w:t>
-            </w:r>
-            <w:r>
-              <w:rPr>
-                <w:sz w:val="16"/>
-                <w:lang w:eastAsia="ko-KR"/>
-              </w:rPr>
-              <w:t>과정을</w:t>
-            </w:r>
-            <w:r>
-              <w:rPr>
-                <w:sz w:val="16"/>
-                <w:lang w:eastAsia="ko-KR"/>
-              </w:rPr>
-              <w:t xml:space="preserve"> </w:t>
-            </w:r>
-            <w:r>
-              <w:rPr>
-                <w:sz w:val="16"/>
-                <w:lang w:eastAsia="ko-KR"/>
-              </w:rPr>
-              <w:lastRenderedPageBreak/>
-              <w:t>여러</w:t>
-            </w:r>
-            <w:r>
-              <w:rPr>
-                <w:sz w:val="16"/>
-                <w:lang w:eastAsia="ko-KR"/>
-              </w:rPr>
-              <w:t xml:space="preserve"> </w:t>
-            </w:r>
-            <w:r>
-              <w:rPr>
-                <w:sz w:val="16"/>
-                <w:lang w:eastAsia="ko-KR"/>
-              </w:rPr>
-              <w:t>구성</w:t>
-            </w:r>
-            <w:r>
-              <w:rPr>
-                <w:sz w:val="16"/>
-                <w:lang w:eastAsia="ko-KR"/>
-              </w:rPr>
-              <w:t xml:space="preserve"> </w:t>
-            </w:r>
-            <w:r>
-              <w:rPr>
-                <w:sz w:val="16"/>
-                <w:lang w:eastAsia="ko-KR"/>
-              </w:rPr>
-              <w:t>단계로</w:t>
-            </w:r>
-            <w:r>
-              <w:rPr>
-                <w:sz w:val="16"/>
-                <w:lang w:eastAsia="ko-KR"/>
-              </w:rPr>
-              <w:t xml:space="preserve"> </w:t>
-            </w:r>
-            <w:r>
-              <w:rPr>
-                <w:sz w:val="16"/>
-                <w:lang w:eastAsia="ko-KR"/>
-              </w:rPr>
-              <w:t>분리</w:t>
-            </w:r>
-          </w:p>
-        </w:tc>
-        <w:tc>
-          <w:tcPr>
-            <w:tcW w:w="2045" w:type="dxa"/>
-            <w:vAlign w:val="center"/>
-          </w:tcPr>
-          <w:p>
+              <w:t xml:space="preserve"> / </w:t>
+            </w:r>
             <w:proofErr w:type="spellStart"/>
             <w:r>
               <w:rPr>
                 <w:sz w:val="16"/>
               </w:rPr>
-              <w:lastRenderedPageBreak/>
-              <w:t>RAGAgentBuilder</w:t>
+              <w:t>HybridRetriever</w:t>
             </w:r>
             <w:proofErr w:type="spellEnd"/>
           </w:p>
@@ -11617,7 +11527,7 @@
               <w:rPr>
                 <w:sz w:val="16"/>
               </w:rPr>
-              <w:t>Factory Method</w:t>
+              <w:t>Builder</w:t>
             </w:r>
           </w:p>
         </w:tc>
@@ -11637,7 +11547,7 @@
                 <w:sz w:val="16"/>
                 <w:lang w:eastAsia="ko-KR"/>
               </w:rPr>
-              <w:t>구체</w:t>
+              <w:t>복잡한</w:t>
             </w:r>
             <w:r>
               <w:rPr>
@@ -11651,7 +11561,7 @@
                 <w:sz w:val="16"/>
                 <w:lang w:eastAsia="ko-KR"/>
               </w:rPr>
-              <w:t>객체</w:t>
+              <w:t>객체를</w:t>
             </w:r>
             <w:r>
               <w:rPr>
@@ -11665,7 +11575,7 @@
                 <w:sz w:val="16"/>
                 <w:lang w:eastAsia="ko-KR"/>
               </w:rPr>
-              <w:t>생성을</w:t>
+              <w:t>어떻게</w:t>
             </w:r>
             <w:r>
               <w:rPr>
@@ -11679,7 +11589,8 @@
                 <w:sz w:val="16"/>
                 <w:lang w:eastAsia="ko-KR"/>
               </w:rPr>
-              <w:t>어떻게</w:t>
+              <w:lastRenderedPageBreak/>
+              <w:t>단계적으로</w:t>
             </w:r>
             <w:r>
               <w:rPr>
@@ -11693,7 +11604,7 @@
                 <w:sz w:val="16"/>
                 <w:lang w:eastAsia="ko-KR"/>
               </w:rPr>
-              <w:t>위임하는가</w:t>
+              <w:t>구성하는가</w:t>
             </w:r>
             <w:r>
               <w:rPr>
@@ -11720,7 +11631,8 @@
                 <w:sz w:val="16"/>
                 <w:lang w:eastAsia="ko-KR"/>
               </w:rPr>
-              <w:t>객체</w:t>
+              <w:lastRenderedPageBreak/>
+              <w:t>복합</w:t>
             </w:r>
             <w:r>
               <w:rPr>
@@ -11734,6 +11646,20 @@
                 <w:sz w:val="16"/>
                 <w:lang w:eastAsia="ko-KR"/>
               </w:rPr>
+              <w:t>객체의</w:t>
+            </w:r>
+            <w:r>
+              <w:rPr>
+                <w:sz w:val="16"/>
+                <w:lang w:eastAsia="ko-KR"/>
+              </w:rPr>
+              <w:t xml:space="preserve"> </w:t>
+            </w:r>
+            <w:r>
+              <w:rPr>
+                <w:sz w:val="16"/>
+                <w:lang w:eastAsia="ko-KR"/>
+              </w:rPr>
               <w:t>생성</w:t>
             </w:r>
             <w:r>
@@ -11741,20 +11667,6 @@
                 <w:sz w:val="16"/>
                 <w:lang w:eastAsia="ko-KR"/>
               </w:rPr>
-              <w:t xml:space="preserve"> Interface</w:t>
-            </w:r>
-            <w:r>
-              <w:rPr>
-                <w:sz w:val="16"/>
-                <w:lang w:eastAsia="ko-KR"/>
-              </w:rPr>
-              <w:t>를</w:t>
-            </w:r>
-            <w:r>
-              <w:rPr>
-                <w:sz w:val="16"/>
-                <w:lang w:eastAsia="ko-KR"/>
-              </w:rPr>
               <w:t xml:space="preserve"> </w:t>
             </w:r>
             <w:r>
@@ -11762,7 +11674,7 @@
                 <w:sz w:val="16"/>
                 <w:lang w:eastAsia="ko-KR"/>
               </w:rPr>
-              <w:t>정의하고</w:t>
+              <w:t>과정을</w:t>
             </w:r>
             <w:r>
               <w:rPr>
@@ -11776,7 +11688,8 @@
                 <w:sz w:val="16"/>
                 <w:lang w:eastAsia="ko-KR"/>
               </w:rPr>
-              <w:t>구체</w:t>
+              <w:lastRenderedPageBreak/>
+              <w:t>여러</w:t>
             </w:r>
             <w:r>
               <w:rPr>
@@ -11790,7 +11703,7 @@
                 <w:sz w:val="16"/>
                 <w:lang w:eastAsia="ko-KR"/>
               </w:rPr>
-              <w:t>생성</w:t>
+              <w:t>구성</w:t>
             </w:r>
             <w:r>
               <w:rPr>
@@ -11804,21 +11717,7 @@
                 <w:sz w:val="16"/>
                 <w:lang w:eastAsia="ko-KR"/>
               </w:rPr>
-              <w:t>타입의</w:t>
-            </w:r>
-            <w:r>
-              <w:rPr>
-                <w:sz w:val="16"/>
-                <w:lang w:eastAsia="ko-KR"/>
-              </w:rPr>
-              <w:t xml:space="preserve"> </w:t>
-            </w:r>
-            <w:r>
-              <w:rPr>
-                <w:sz w:val="16"/>
-                <w:lang w:eastAsia="ko-KR"/>
-              </w:rPr>
-              <w:t>결정을</w:t>
+              <w:t>단계로</w:t>
             </w:r>
             <w:r>
               <w:rPr>
@@ -11847,6 +11746,271 @@
               <w:rPr>
                 <w:sz w:val="16"/>
               </w:rPr>
+              <w:lastRenderedPageBreak/>
+              <w:t>RAGAgentBuilder</w:t>
+            </w:r>
+            <w:proofErr w:type="spellEnd"/>
+          </w:p>
+        </w:tc>
+      </w:tr>
+      <w:tr>
+        <w:trPr>
+          <w:jc w:val="center"/>
+        </w:trPr>
+        <w:tc>
+          <w:tcPr>
+            <w:tcW w:w="2045" w:type="dxa"/>
+            <w:vAlign w:val="center"/>
+          </w:tcPr>
+          <w:p>
+            <w:r>
+              <w:rPr>
+                <w:sz w:val="16"/>
+              </w:rPr>
+              <w:t>Creational</w:t>
+            </w:r>
+          </w:p>
+        </w:tc>
+        <w:tc>
+          <w:tcPr>
+            <w:tcW w:w="2045" w:type="dxa"/>
+            <w:vAlign w:val="center"/>
+          </w:tcPr>
+          <w:p>
+            <w:r>
+              <w:rPr>
+                <w:sz w:val="16"/>
+              </w:rPr>
+              <w:t>Factory Method</w:t>
+            </w:r>
+          </w:p>
+        </w:tc>
+        <w:tc>
+          <w:tcPr>
+            <w:tcW w:w="2045" w:type="dxa"/>
+            <w:vAlign w:val="center"/>
+          </w:tcPr>
+          <w:p>
+            <w:pPr>
+              <w:rPr>
+                <w:lang w:eastAsia="ko-KR"/>
+              </w:rPr>
+            </w:pPr>
+            <w:r>
+              <w:rPr>
+                <w:sz w:val="16"/>
+                <w:lang w:eastAsia="ko-KR"/>
+              </w:rPr>
+              <w:t>구체</w:t>
+            </w:r>
+            <w:r>
+              <w:rPr>
+                <w:sz w:val="16"/>
+                <w:lang w:eastAsia="ko-KR"/>
+              </w:rPr>
+              <w:t xml:space="preserve"> </w:t>
+            </w:r>
+            <w:r>
+              <w:rPr>
+                <w:sz w:val="16"/>
+                <w:lang w:eastAsia="ko-KR"/>
+              </w:rPr>
+              <w:t>객체</w:t>
+            </w:r>
+            <w:r>
+              <w:rPr>
+                <w:sz w:val="16"/>
+                <w:lang w:eastAsia="ko-KR"/>
+              </w:rPr>
+              <w:t xml:space="preserve"> </w:t>
+            </w:r>
+            <w:r>
+              <w:rPr>
+                <w:sz w:val="16"/>
+                <w:lang w:eastAsia="ko-KR"/>
+              </w:rPr>
+              <w:t>생성을</w:t>
+            </w:r>
+            <w:r>
+              <w:rPr>
+                <w:sz w:val="16"/>
+                <w:lang w:eastAsia="ko-KR"/>
+              </w:rPr>
+              <w:t xml:space="preserve"> </w:t>
+            </w:r>
+            <w:r>
+              <w:rPr>
+                <w:sz w:val="16"/>
+                <w:lang w:eastAsia="ko-KR"/>
+              </w:rPr>
+              <w:t>어떻게</w:t>
+            </w:r>
+            <w:r>
+              <w:rPr>
+                <w:sz w:val="16"/>
+                <w:lang w:eastAsia="ko-KR"/>
+              </w:rPr>
+              <w:t xml:space="preserve"> </w:t>
+            </w:r>
+            <w:r>
+              <w:rPr>
+                <w:sz w:val="16"/>
+                <w:lang w:eastAsia="ko-KR"/>
+              </w:rPr>
+              <w:t>위임하는가</w:t>
+            </w:r>
+            <w:r>
+              <w:rPr>
+                <w:sz w:val="16"/>
+                <w:lang w:eastAsia="ko-KR"/>
+              </w:rPr>
+              <w:t>?</w:t>
+            </w:r>
+          </w:p>
+        </w:tc>
+        <w:tc>
+          <w:tcPr>
+            <w:tcW w:w="2045" w:type="dxa"/>
+            <w:vAlign w:val="center"/>
+          </w:tcPr>
+          <w:p>
+            <w:pPr>
+              <w:rPr>
+                <w:lang w:eastAsia="ko-KR"/>
+              </w:rPr>
+            </w:pPr>
+            <w:r>
+              <w:rPr>
+                <w:sz w:val="16"/>
+                <w:lang w:eastAsia="ko-KR"/>
+              </w:rPr>
+              <w:t>객체</w:t>
+            </w:r>
+            <w:r>
+              <w:rPr>
+                <w:sz w:val="16"/>
+                <w:lang w:eastAsia="ko-KR"/>
+              </w:rPr>
+              <w:t xml:space="preserve"> </w:t>
+            </w:r>
+            <w:r>
+              <w:rPr>
+                <w:sz w:val="16"/>
+                <w:lang w:eastAsia="ko-KR"/>
+              </w:rPr>
+              <w:t>생성</w:t>
+            </w:r>
+            <w:r>
+              <w:rPr>
+                <w:sz w:val="16"/>
+                <w:lang w:eastAsia="ko-KR"/>
+              </w:rPr>
+              <w:t xml:space="preserve"> Interface</w:t>
+            </w:r>
+            <w:r>
+              <w:rPr>
+                <w:sz w:val="16"/>
+                <w:lang w:eastAsia="ko-KR"/>
+              </w:rPr>
+              <w:t>를</w:t>
+            </w:r>
+            <w:r>
+              <w:rPr>
+                <w:sz w:val="16"/>
+                <w:lang w:eastAsia="ko-KR"/>
+              </w:rPr>
+              <w:t xml:space="preserve"> </w:t>
+            </w:r>
+            <w:r>
+              <w:rPr>
+                <w:sz w:val="16"/>
+                <w:lang w:eastAsia="ko-KR"/>
+              </w:rPr>
+              <w:t>정의하고</w:t>
+            </w:r>
+            <w:r>
+              <w:rPr>
+                <w:sz w:val="16"/>
+                <w:lang w:eastAsia="ko-KR"/>
+              </w:rPr>
+              <w:t xml:space="preserve"> </w:t>
+            </w:r>
+            <w:r>
+              <w:rPr>
+                <w:sz w:val="16"/>
+                <w:lang w:eastAsia="ko-KR"/>
+              </w:rPr>
+              <w:t>구체</w:t>
+            </w:r>
+            <w:r>
+              <w:rPr>
+                <w:sz w:val="16"/>
+                <w:lang w:eastAsia="ko-KR"/>
+              </w:rPr>
+              <w:t xml:space="preserve"> </w:t>
+            </w:r>
+            <w:r>
+              <w:rPr>
+                <w:sz w:val="16"/>
+                <w:lang w:eastAsia="ko-KR"/>
+              </w:rPr>
+              <w:t>생성</w:t>
+            </w:r>
+            <w:r>
+              <w:rPr>
+                <w:sz w:val="16"/>
+                <w:lang w:eastAsia="ko-KR"/>
+              </w:rPr>
+              <w:t xml:space="preserve"> </w:t>
+            </w:r>
+            <w:r>
+              <w:rPr>
+                <w:sz w:val="16"/>
+                <w:lang w:eastAsia="ko-KR"/>
+              </w:rPr>
+              <w:t>타입의</w:t>
+            </w:r>
+            <w:r>
+              <w:rPr>
+                <w:sz w:val="16"/>
+                <w:lang w:eastAsia="ko-KR"/>
+              </w:rPr>
+              <w:t xml:space="preserve"> </w:t>
+            </w:r>
+            <w:r>
+              <w:rPr>
+                <w:sz w:val="16"/>
+                <w:lang w:eastAsia="ko-KR"/>
+              </w:rPr>
+              <w:t>결정을</w:t>
+            </w:r>
+            <w:r>
+              <w:rPr>
+                <w:sz w:val="16"/>
+                <w:lang w:eastAsia="ko-KR"/>
+              </w:rPr>
+              <w:t xml:space="preserve"> </w:t>
+            </w:r>
+            <w:r>
+              <w:rPr>
+                <w:sz w:val="16"/>
+                <w:lang w:eastAsia="ko-KR"/>
+              </w:rPr>
+              <w:t>분리</w:t>
+            </w:r>
+          </w:p>
+        </w:tc>
+        <w:tc>
+          <w:tcPr>
+            <w:tcW w:w="2045" w:type="dxa"/>
+            <w:vAlign w:val="center"/>
+          </w:tcPr>
+          <w:p>
+            <w:proofErr w:type="spellStart"/>
+            <w:r>
+              <w:rPr>
+                <w:sz w:val="16"/>
+              </w:rPr>
               <w:t>LanguageModel</w:t>
             </w:r>
             <w:proofErr w:type="spellEnd"/>
@@ -11884,12 +12048,14 @@
               </w:rPr>
               <w:t xml:space="preserve"> </w:t>
             </w:r>
+            <w:proofErr w:type="spellStart"/>
             <w:r>
               <w:rPr>
                 <w:sz w:val="16"/>
               </w:rPr>
               <w:t>적용</w:t>
             </w:r>
+            <w:proofErr w:type="spellEnd"/>
             <w:r>
               <w:rPr>
                 <w:sz w:val="16"/>
@@ -19251,6 +19417,7 @@
   <w:style w:type="character" w:default="1" w:styleId="a2">
     <w:name w:val="Default Paragraph Font"/>
     <w:uiPriority w:val="1"/>
+    <w:semiHidden/>
     <w:unhideWhenUsed/>
   </w:style>
   <w:style w:type="table" w:default="1" w:styleId="a3">

</xml_diff>